<commit_message>
RegisterV2: de trong khu vuc ca khi cong BHXH loi / the khong hop le, them luong doc the KCB
- ProcessLiveAreaByGovResult(ResultDataADO): cau hinh bat => cong xac nhan the (000/003/004) lay maKV,
  cong loi (ResultHistoryLDO null) hoac ma ket qua khac => de trong; khong goi cong / whitelist 9999 => giu nguyen
- Goi ngoai khoi ResultHistoryLDO != null trong CheckTTProcessResultData (3 tham so) va them vao overload 1 tham so (doc the KCB)
- Log Info moi nhanh (isEnabled, resultCode, liveAreaCode)
- Cap nhat tai lieu nghiep vu, ky thuat, module, SQL (UPDATE DESCRIPTION)

Co-Authored-By: Claude Opus 5.5 <noreply@anthropic.com>
</commit_message>
<xml_diff>
--- a/docs/A_NghiepVu_RegisterV2_DeTrongKhuVucTheBHYT.docx
+++ b/docs/A_NghiepVu_RegisterV2_DeTrongKhuVucTheBHYT.docx
@@ -321,7 +321,7 @@
                 <w:sz w:val="21"/>
                 <w:szCs w:val="21"/>
               </w:rPr>
-              <w:t xml:space="preserve"> khi thẻ BHYT trên cổng BHXH không có khu vực</w:t>
+              <w:t xml:space="preserve">: khu vực chỉ lấy theo kết quả kiểm tra thẻ trên cổng BHXH</w:t>
             </w:r>
           </w:p>
         </w:tc>
@@ -456,6 +456,68 @@
                 <w:szCs w:val="21"/>
               </w:rPr>
               <w:t xml:space="preserve">27/10/2026</w:t>
+            </w:r>
+          </w:p>
+        </w:tc>
+      </w:tr>
+      <w:tr>
+        <w:tc>
+          <w:tcPr>
+            <w:tcW w:type="dxa" w:w="1883"/>
+            <w:tcBorders>
+              <w:top w:val="single" w:color="808080" w:sz="4"/>
+              <w:left w:val="single" w:color="808080" w:sz="4"/>
+              <w:bottom w:val="single" w:color="808080" w:sz="4"/>
+              <w:right w:val="single" w:color="808080" w:sz="4"/>
+            </w:tcBorders>
+            <w:tcMar>
+              <w:top w:type="dxa" w:w="60"/>
+              <w:left w:type="dxa" w:w="100"/>
+              <w:bottom w:type="dxa" w:w="60"/>
+              <w:right w:type="dxa" w:w="100"/>
+            </w:tcMar>
+          </w:tcPr>
+          <w:p>
+            <w:pPr>
+              <w:spacing w:before="0" w:after="0"/>
+            </w:pPr>
+            <w:r>
+              <w:rPr>
+                <w:rFonts w:ascii="Arial" w:cs="Arial" w:eastAsia="Arial" w:hAnsi="Arial"/>
+                <w:sz w:val="21"/>
+                <w:szCs w:val="21"/>
+              </w:rPr>
+              <w:t xml:space="preserve">Cập nhật</w:t>
+            </w:r>
+          </w:p>
+        </w:tc>
+        <w:tc>
+          <w:tcPr>
+            <w:tcW w:type="dxa" w:w="7755"/>
+            <w:tcBorders>
+              <w:top w:val="single" w:color="808080" w:sz="4"/>
+              <w:left w:val="single" w:color="808080" w:sz="4"/>
+              <w:bottom w:val="single" w:color="808080" w:sz="4"/>
+              <w:right w:val="single" w:color="808080" w:sz="4"/>
+            </w:tcBorders>
+            <w:tcMar>
+              <w:top w:type="dxa" w:w="60"/>
+              <w:left w:type="dxa" w:w="100"/>
+              <w:bottom w:type="dxa" w:w="60"/>
+              <w:right w:type="dxa" w:w="100"/>
+            </w:tcMar>
+          </w:tcPr>
+          <w:p>
+            <w:pPr>
+              <w:spacing w:before="0" w:after="0"/>
+            </w:pPr>
+            <w:r>
+              <w:rPr>
+                <w:rFonts w:ascii="Arial" w:cs="Arial" w:eastAsia="Arial" w:hAnsi="Arial"/>
+                <w:sz w:val="21"/>
+                <w:szCs w:val="21"/>
+              </w:rPr>
+              <w:t xml:space="preserve">30/10/2026: cổng BHXH lỗi / mất kết nối / báo thẻ không hợp lệ cũng để trống khu vực; áp dụng thêm cho đọc thẻ KCB</w:t>
             </w:r>
           </w:p>
         </w:tc>
@@ -705,6 +767,35 @@
         <w:rPr>
           <w:rFonts w:ascii="Arial" w:cs="Arial" w:eastAsia="Arial" w:hAnsi="Arial"/>
         </w:rPr>
+        <w:t xml:space="preserve">Cổng BHXH lỗi, mất kết nối hoặc báo thẻ không hợp lệ (không có căn cứ khu vực) thì ô "Khu vực" cũng </w:t>
+      </w:r>
+      <w:r>
+        <w:rPr>
+          <w:rFonts w:ascii="Arial" w:cs="Arial" w:eastAsia="Arial" w:hAnsi="Arial"/>
+          <w:b/>
+          <w:bCs/>
+        </w:rPr>
+        <w:t xml:space="preserve">để trống</w:t>
+      </w:r>
+      <w:r>
+        <w:rPr>
+          <w:rFonts w:ascii="Arial" w:cs="Arial" w:eastAsia="Arial" w:hAnsi="Arial"/>
+        </w:rPr>
+        <w:t xml:space="preserve">.</w:t>
+      </w:r>
+    </w:p>
+    <w:p>
+      <w:pPr>
+        <w:pStyle w:val="ListParagraph"/>
+        <w:numPr>
+          <w:ilvl w:val="0"/>
+          <w:numId w:val="2"/>
+        </w:numPr>
+      </w:pPr>
+      <w:r>
+        <w:rPr>
+          <w:rFonts w:ascii="Arial" w:cs="Arial" w:eastAsia="Arial" w:hAnsi="Arial"/>
+        </w:rPr>
         <w:t xml:space="preserve">Thẻ có khu vực K1/K2/K3 thì điền đúng khu vực đó như hiện nay.</w:t>
       </w:r>
     </w:p>
@@ -959,7 +1050,7 @@
                 <w:sz w:val="21"/>
                 <w:szCs w:val="21"/>
               </w:rPr>
-              <w:t xml:space="preserve">Mọi cách kiểm tra thẻ trên màn Tiếp đón: nhập số thẻ, quét QR thẻ BHYT, quét CCCD, tìm người bệnh cũ, tự chuyển sang đối tượng BHYT</w:t>
+              <w:t xml:space="preserve">Mọi cách kiểm tra thẻ trên màn Tiếp đón: nhập số thẻ, quét QR thẻ BHYT, quét CCCD, tìm người bệnh cũ, đọc thẻ KCB, tự chuyển sang đối tượng BHYT</w:t>
             </w:r>
           </w:p>
         </w:tc>
@@ -1880,7 +1971,21 @@
         <w:rPr>
           <w:rFonts w:ascii="Arial" w:cs="Arial" w:eastAsia="Arial" w:hAnsi="Arial"/>
         </w:rPr>
-        <w:t xml:space="preserve"> cổng BHXH đã xác nhận được thông tin thẻ thì khu vực lấy đúng theo cổng. Cổng không có khu vực thì để trống.</w:t>
+        <w:t xml:space="preserve"> khu vực chỉ lấy theo kết quả kiểm tra thẻ trên cổng BHXH. Cổng xác nhận được thẻ thì lấy đúng khu vực của cổng (cổng không có khu vực thì để trống). Cổng không xác nhận được thẻ (lỗi, mất kết nối, thẻ không hợp lệ) thì không có căn cứ, </w:t>
+      </w:r>
+      <w:r>
+        <w:rPr>
+          <w:rFonts w:ascii="Arial" w:cs="Arial" w:eastAsia="Arial" w:hAnsi="Arial"/>
+          <w:b/>
+          <w:bCs/>
+        </w:rPr>
+        <w:t xml:space="preserve">để trống</w:t>
+      </w:r>
+      <w:r>
+        <w:rPr>
+          <w:rFonts w:ascii="Arial" w:cs="Arial" w:eastAsia="Arial" w:hAnsi="Arial"/>
+        </w:rPr>
+        <w:t xml:space="preserve">.</w:t>
       </w:r>
     </w:p>
     <w:tbl>
@@ -2483,7 +2588,7 @@
                 <w:sz w:val="21"/>
                 <w:szCs w:val="21"/>
               </w:rPr>
-              <w:t xml:space="preserve">Cổng BHXH lỗi, mất kết nối, hoặc viện không bật kiểm tra thẻ qua cổng</w:t>
+              <w:t xml:space="preserve">Cổng BHXH lỗi, mất kết nối</w:t>
             </w:r>
           </w:p>
         </w:tc>
@@ -2513,7 +2618,7 @@
                 <w:sz w:val="21"/>
                 <w:szCs w:val="21"/>
               </w:rPr>
-              <w:t xml:space="preserve">Không có căn cứ từ cổng, </w:t>
+              <w:t xml:space="preserve">Không có căn cứ từ cổng, ô "Khu vực" </w:t>
             </w:r>
             <w:r>
               <w:rPr>
@@ -2523,15 +2628,7 @@
                 <w:sz w:val="21"/>
                 <w:szCs w:val="21"/>
               </w:rPr>
-              <w:t xml:space="preserve">giữ nguyên như hiện nay</w:t>
-            </w:r>
-            <w:r>
-              <w:rPr>
-                <w:rFonts w:ascii="Arial" w:cs="Arial" w:eastAsia="Arial" w:hAnsi="Arial"/>
-                <w:sz w:val="21"/>
-                <w:szCs w:val="21"/>
-              </w:rPr>
-              <w:t xml:space="preserve"> (không làm trống khu vực)</w:t>
+              <w:t xml:space="preserve">để trống</w:t>
             </w:r>
           </w:p>
         </w:tc>
@@ -2593,7 +2690,7 @@
                 <w:sz w:val="21"/>
                 <w:szCs w:val="21"/>
               </w:rPr>
-              <w:t xml:space="preserve">Cổng báo thẻ sai thông tin / không hợp lệ</w:t>
+              <w:t xml:space="preserve">Cổng báo thẻ sai thông tin / không hợp lệ / không tồn tại</w:t>
             </w:r>
           </w:p>
         </w:tc>
@@ -2623,7 +2720,119 @@
                 <w:sz w:val="21"/>
                 <w:szCs w:val="21"/>
               </w:rPr>
-              <w:t xml:space="preserve">Giữ nguyên như hiện nay</w:t>
+              <w:t xml:space="preserve">Ô "Khu vực" </w:t>
+            </w:r>
+            <w:r>
+              <w:rPr>
+                <w:rFonts w:ascii="Arial" w:cs="Arial" w:eastAsia="Arial" w:hAnsi="Arial"/>
+                <w:b/>
+                <w:bCs/>
+                <w:sz w:val="21"/>
+                <w:szCs w:val="21"/>
+              </w:rPr>
+              <w:t xml:space="preserve">để trống</w:t>
+            </w:r>
+          </w:p>
+        </w:tc>
+      </w:tr>
+      <w:tr>
+        <w:tc>
+          <w:tcPr>
+            <w:tcW w:type="dxa" w:w="700"/>
+            <w:tcBorders>
+              <w:top w:val="single" w:color="808080" w:sz="4"/>
+              <w:left w:val="single" w:color="808080" w:sz="4"/>
+              <w:bottom w:val="single" w:color="808080" w:sz="4"/>
+              <w:right w:val="single" w:color="808080" w:sz="4"/>
+            </w:tcBorders>
+            <w:tcMar>
+              <w:top w:type="dxa" w:w="60"/>
+              <w:left w:type="dxa" w:w="100"/>
+              <w:bottom w:type="dxa" w:w="60"/>
+              <w:right w:type="dxa" w:w="100"/>
+            </w:tcMar>
+          </w:tcPr>
+          <w:p>
+            <w:pPr>
+              <w:spacing w:before="0" w:after="0"/>
+            </w:pPr>
+            <w:r>
+              <w:rPr>
+                <w:rFonts w:ascii="Arial" w:cs="Arial" w:eastAsia="Arial" w:hAnsi="Arial"/>
+                <w:sz w:val="21"/>
+                <w:szCs w:val="21"/>
+              </w:rPr>
+              <w:t xml:space="preserve">6a</w:t>
+            </w:r>
+          </w:p>
+        </w:tc>
+        <w:tc>
+          <w:tcPr>
+            <w:tcW w:type="dxa" w:w="4685"/>
+            <w:tcBorders>
+              <w:top w:val="single" w:color="808080" w:sz="4"/>
+              <w:left w:val="single" w:color="808080" w:sz="4"/>
+              <w:bottom w:val="single" w:color="808080" w:sz="4"/>
+              <w:right w:val="single" w:color="808080" w:sz="4"/>
+            </w:tcBorders>
+            <w:tcMar>
+              <w:top w:type="dxa" w:w="60"/>
+              <w:left w:type="dxa" w:w="100"/>
+              <w:bottom w:type="dxa" w:w="60"/>
+              <w:right w:type="dxa" w:w="100"/>
+            </w:tcMar>
+          </w:tcPr>
+          <w:p>
+            <w:pPr>
+              <w:spacing w:before="0" w:after="0"/>
+            </w:pPr>
+            <w:r>
+              <w:rPr>
+                <w:rFonts w:ascii="Arial" w:cs="Arial" w:eastAsia="Arial" w:hAnsi="Arial"/>
+                <w:sz w:val="21"/>
+                <w:szCs w:val="21"/>
+              </w:rPr>
+              <w:t xml:space="preserve">Viện không bật kiểm tra thẻ qua cổng, hoặc đầu thẻ thuộc danh mục "không kiểm tra thông tin thẻ trên cổng BHYT", hoặc chưa khai báo tài khoản kết nối cổng</w:t>
+            </w:r>
+          </w:p>
+        </w:tc>
+        <w:tc>
+          <w:tcPr>
+            <w:tcW w:type="dxa" w:w="4253"/>
+            <w:tcBorders>
+              <w:top w:val="single" w:color="808080" w:sz="4"/>
+              <w:left w:val="single" w:color="808080" w:sz="4"/>
+              <w:bottom w:val="single" w:color="808080" w:sz="4"/>
+              <w:right w:val="single" w:color="808080" w:sz="4"/>
+            </w:tcBorders>
+            <w:tcMar>
+              <w:top w:type="dxa" w:w="60"/>
+              <w:left w:type="dxa" w:w="100"/>
+              <w:bottom w:type="dxa" w:w="60"/>
+              <w:right w:type="dxa" w:w="100"/>
+            </w:tcMar>
+          </w:tcPr>
+          <w:p>
+            <w:pPr>
+              <w:spacing w:before="0" w:after="0"/>
+            </w:pPr>
+            <w:r>
+              <w:rPr>
+                <w:rFonts w:ascii="Arial" w:cs="Arial" w:eastAsia="Arial" w:hAnsi="Arial"/>
+                <w:sz w:val="21"/>
+                <w:szCs w:val="21"/>
+              </w:rPr>
+              <w:t xml:space="preserve">Phần mềm không tra cứu cổng, </w:t>
+            </w:r>
+            <w:r>
+              <w:rPr>
+                <w:rFonts w:ascii="Arial" w:cs="Arial" w:eastAsia="Arial" w:hAnsi="Arial"/>
+                <w:b/>
+                <w:bCs/>
+                <w:sz w:val="21"/>
+                <w:szCs w:val="21"/>
+              </w:rPr>
+              <w:t xml:space="preserve">giữ nguyên như hiện nay</w:t>
             </w:r>
           </w:p>
         </w:tc>
@@ -3297,7 +3506,25 @@
                 <w:sz w:val="21"/>
                 <w:szCs w:val="21"/>
               </w:rPr>
-              <w:t xml:space="preserve">; cổng không có khu vực thì để trống ô "Khu vực"</w:t>
+              <w:t xml:space="preserve">; cổng không có khu vực thì để trống ô "Khu vực". Cổng lỗi hoặc báo thẻ không hợp lệ: </w:t>
+            </w:r>
+            <w:r>
+              <w:rPr>
+                <w:rFonts w:ascii="Arial" w:cs="Arial" w:eastAsia="Arial" w:hAnsi="Arial"/>
+                <w:b/>
+                <w:bCs/>
+                <w:sz w:val="21"/>
+                <w:szCs w:val="21"/>
+              </w:rPr>
+              <w:t xml:space="preserve">để trống</w:t>
+            </w:r>
+            <w:r>
+              <w:rPr>
+                <w:rFonts w:ascii="Arial" w:cs="Arial" w:eastAsia="Arial" w:hAnsi="Arial"/>
+                <w:sz w:val="21"/>
+                <w:szCs w:val="21"/>
+              </w:rPr>
+              <w:t xml:space="preserve"> ô "Khu vực"</w:t>
             </w:r>
           </w:p>
         </w:tc>
@@ -3981,7 +4208,7 @@
           <w:i/>
           <w:iCs/>
         </w:rPr>
-        <w:t xml:space="preserve">• 1: Khi kiểm tra thẻ BHYT trên cổng BHXH, khu vực chỉ lấy theo kết quả trả về của cổng. Thẻ không có mã khu vực thì để trống ô "Khu vực", không lấy khu vực của đợt khám chữa bệnh trước. Các thông tin khác của đợt khám chữa bệnh trước vẫn được lấy lại như hiện tại.</w:t>
+        <w:t xml:space="preserve">• 1: Khi kiểm tra thẻ BHYT trên cổng BHXH, khu vực chỉ lấy theo kết quả trả về của cổng. Thẻ không có mã khu vực, hoặc cổng lỗi / không kết nối được / báo thẻ không hợp lệ thì để trống ô "Khu vực", không lấy khu vực của đợt khám chữa bệnh trước. Các thông tin khác của đợt khám chữa bệnh trước vẫn được lấy lại như hiện tại.</w:t>
       </w:r>
     </w:p>
     <w:p>
@@ -4015,7 +4242,7 @@
           <w:i/>
           <w:iCs/>
         </w:rPr>
-        <w:t xml:space="preserve">Chỉ áp dụng khi cổng BHXH trả về thông tin thẻ. Cổng lỗi hoặc không kết nối được thì giữ nguyên như hiện tại.</w:t>
+        <w:t xml:space="preserve">Không áp dụng khi phần mềm không tra cứu cổng (tắt kiểm tra thẻ qua cổng, đầu thẻ thuộc danh mục không kiểm tra trên cổng).</w:t>
       </w:r>
     </w:p>
     <w:p>
@@ -4451,7 +4678,7 @@
                 <w:sz w:val="21"/>
                 <w:szCs w:val="21"/>
               </w:rPr>
-              <w:t xml:space="preserve">Cổng BHXH lỗi hoặc mất kết nối thì khu vực cũ vẫn được giữ</w:t>
+              <w:t xml:space="preserve">Cổng BHXH lỗi hoặc mất kết nối thì ô "Khu vực" bị để trống, kể cả khi thẻ thực tế có khu vực</w:t>
             </w:r>
           </w:p>
         </w:tc>
@@ -4481,7 +4708,7 @@
                 <w:sz w:val="21"/>
                 <w:szCs w:val="21"/>
               </w:rPr>
-              <w:t xml:space="preserve">Nhân viên tự kiểm tra và xóa khu vực nếu cần</w:t>
+              <w:t xml:space="preserve">Nếu có căn cứ (thẻ giấy, kiểm tra lại khi cổng thông), nhân viên tự chọn lại khu vực trước khi lưu</w:t>
             </w:r>
           </w:p>
         </w:tc>
@@ -4714,8 +4941,8 @@
       </w:tblPr>
       <w:tblGrid>
         <w:gridCol w:w="700"/>
-        <w:gridCol w:w="4784"/>
-        <w:gridCol w:w="4154"/>
+        <w:gridCol w:w="4717"/>
+        <w:gridCol w:w="4221"/>
       </w:tblGrid>
       <w:tr>
         <w:trPr>
@@ -4756,7 +4983,7 @@
         </w:tc>
         <w:tc>
           <w:tcPr>
-            <w:tcW w:type="dxa" w:w="4784"/>
+            <w:tcW w:type="dxa" w:w="4717"/>
             <w:tcBorders>
               <w:top w:val="single" w:color="808080" w:sz="4"/>
               <w:left w:val="single" w:color="808080" w:sz="4"/>
@@ -4789,7 +5016,7 @@
         </w:tc>
         <w:tc>
           <w:tcPr>
-            <w:tcW w:type="dxa" w:w="4154"/>
+            <w:tcW w:type="dxa" w:w="4221"/>
             <w:tcBorders>
               <w:top w:val="single" w:color="808080" w:sz="4"/>
               <w:left w:val="single" w:color="808080" w:sz="4"/>
@@ -4854,7 +5081,7 @@
         </w:tc>
         <w:tc>
           <w:tcPr>
-            <w:tcW w:type="dxa" w:w="4784"/>
+            <w:tcW w:type="dxa" w:w="4717"/>
             <w:tcBorders>
               <w:top w:val="single" w:color="808080" w:sz="4"/>
               <w:left w:val="single" w:color="808080" w:sz="4"/>
@@ -4884,7 +5111,7 @@
         </w:tc>
         <w:tc>
           <w:tcPr>
-            <w:tcW w:type="dxa" w:w="4154"/>
+            <w:tcW w:type="dxa" w:w="4221"/>
             <w:tcBorders>
               <w:top w:val="single" w:color="808080" w:sz="4"/>
               <w:left w:val="single" w:color="808080" w:sz="4"/>
@@ -4946,7 +5173,7 @@
         </w:tc>
         <w:tc>
           <w:tcPr>
-            <w:tcW w:type="dxa" w:w="4784"/>
+            <w:tcW w:type="dxa" w:w="4717"/>
             <w:tcBorders>
               <w:top w:val="single" w:color="808080" w:sz="4"/>
               <w:left w:val="single" w:color="808080" w:sz="4"/>
@@ -4976,31 +5203,41 @@
         </w:tc>
         <w:tc>
           <w:tcPr>
-            <w:tcW w:type="dxa" w:w="4154"/>
-            <w:tcBorders>
-              <w:top w:val="single" w:color="808080" w:sz="4"/>
-              <w:left w:val="single" w:color="808080" w:sz="4"/>
-              <w:bottom w:val="single" w:color="808080" w:sz="4"/>
-              <w:right w:val="single" w:color="808080" w:sz="4"/>
-            </w:tcBorders>
-            <w:tcMar>
-              <w:top w:type="dxa" w:w="60"/>
-              <w:left w:type="dxa" w:w="100"/>
-              <w:bottom w:type="dxa" w:w="60"/>
-              <w:right w:type="dxa" w:w="100"/>
-            </w:tcMar>
-          </w:tcPr>
-          <w:p>
-            <w:pPr>
-              <w:spacing w:before="0" w:after="0"/>
-            </w:pPr>
-            <w:r>
-              <w:rPr>
-                <w:rFonts w:ascii="Arial" w:cs="Arial" w:eastAsia="Arial" w:hAnsi="Arial"/>
-                <w:sz w:val="21"/>
-                <w:szCs w:val="21"/>
-              </w:rPr>
-              <w:t xml:space="preserve">Giữ nguyên khu vực như hiện nay</w:t>
+            <w:tcW w:type="dxa" w:w="4221"/>
+            <w:tcBorders>
+              <w:top w:val="single" w:color="808080" w:sz="4"/>
+              <w:left w:val="single" w:color="808080" w:sz="4"/>
+              <w:bottom w:val="single" w:color="808080" w:sz="4"/>
+              <w:right w:val="single" w:color="808080" w:sz="4"/>
+            </w:tcBorders>
+            <w:tcMar>
+              <w:top w:type="dxa" w:w="60"/>
+              <w:left w:type="dxa" w:w="100"/>
+              <w:bottom w:type="dxa" w:w="60"/>
+              <w:right w:type="dxa" w:w="100"/>
+            </w:tcMar>
+          </w:tcPr>
+          <w:p>
+            <w:pPr>
+              <w:spacing w:before="0" w:after="0"/>
+            </w:pPr>
+            <w:r>
+              <w:rPr>
+                <w:rFonts w:ascii="Arial" w:cs="Arial" w:eastAsia="Arial" w:hAnsi="Arial"/>
+                <w:b/>
+                <w:bCs/>
+                <w:sz w:val="21"/>
+                <w:szCs w:val="21"/>
+              </w:rPr>
+              <w:t xml:space="preserve">Đã chốt 30/10/2026:</w:t>
+            </w:r>
+            <w:r>
+              <w:rPr>
+                <w:rFonts w:ascii="Arial" w:cs="Arial" w:eastAsia="Arial" w:hAnsi="Arial"/>
+                <w:sz w:val="21"/>
+                <w:szCs w:val="21"/>
+              </w:rPr>
+              <w:t xml:space="preserve"> để trống khu vực (thẻ không hợp lệ cũng để trống)</w:t>
             </w:r>
           </w:p>
         </w:tc>
@@ -5038,7 +5275,7 @@
         </w:tc>
         <w:tc>
           <w:tcPr>
-            <w:tcW w:type="dxa" w:w="4784"/>
+            <w:tcW w:type="dxa" w:w="4717"/>
             <w:tcBorders>
               <w:top w:val="single" w:color="808080" w:sz="4"/>
               <w:left w:val="single" w:color="808080" w:sz="4"/>
@@ -5068,7 +5305,7 @@
         </w:tc>
         <w:tc>
           <w:tcPr>
-            <w:tcW w:type="dxa" w:w="4154"/>
+            <w:tcW w:type="dxa" w:w="4221"/>
             <w:tcBorders>
               <w:top w:val="single" w:color="808080" w:sz="4"/>
               <w:left w:val="single" w:color="808080" w:sz="4"/>
@@ -5130,7 +5367,7 @@
         </w:tc>
         <w:tc>
           <w:tcPr>
-            <w:tcW w:type="dxa" w:w="4784"/>
+            <w:tcW w:type="dxa" w:w="4717"/>
             <w:tcBorders>
               <w:top w:val="single" w:color="808080" w:sz="4"/>
               <w:left w:val="single" w:color="808080" w:sz="4"/>
@@ -5160,7 +5397,7 @@
         </w:tc>
         <w:tc>
           <w:tcPr>
-            <w:tcW w:type="dxa" w:w="4154"/>
+            <w:tcW w:type="dxa" w:w="4221"/>
             <w:tcBorders>
               <w:top w:val="single" w:color="808080" w:sz="4"/>
               <w:left w:val="single" w:color="808080" w:sz="4"/>
@@ -5222,7 +5459,7 @@
         </w:tc>
         <w:tc>
           <w:tcPr>
-            <w:tcW w:type="dxa" w:w="4784"/>
+            <w:tcW w:type="dxa" w:w="4717"/>
             <w:tcBorders>
               <w:top w:val="single" w:color="808080" w:sz="4"/>
               <w:left w:val="single" w:color="808080" w:sz="4"/>
@@ -5252,7 +5489,7 @@
         </w:tc>
         <w:tc>
           <w:tcPr>
-            <w:tcW w:type="dxa" w:w="4154"/>
+            <w:tcW w:type="dxa" w:w="4221"/>
             <w:tcBorders>
               <w:top w:val="single" w:color="808080" w:sz="4"/>
               <w:left w:val="single" w:color="808080" w:sz="4"/>
@@ -5326,9 +5563,9 @@
       <w:tblGrid>
         <w:gridCol w:w="700"/>
         <w:gridCol w:w="700"/>
-        <w:gridCol w:w="3109"/>
-        <w:gridCol w:w="2664"/>
-        <w:gridCol w:w="2465"/>
+        <w:gridCol w:w="2972"/>
+        <w:gridCol w:w="2972"/>
+        <w:gridCol w:w="2294"/>
       </w:tblGrid>
       <w:tr>
         <w:trPr>
@@ -5402,7 +5639,7 @@
         </w:tc>
         <w:tc>
           <w:tcPr>
-            <w:tcW w:type="dxa" w:w="3109"/>
+            <w:tcW w:type="dxa" w:w="2972"/>
             <w:tcBorders>
               <w:top w:val="single" w:color="808080" w:sz="4"/>
               <w:left w:val="single" w:color="808080" w:sz="4"/>
@@ -5435,7 +5672,7 @@
         </w:tc>
         <w:tc>
           <w:tcPr>
-            <w:tcW w:type="dxa" w:w="2664"/>
+            <w:tcW w:type="dxa" w:w="2972"/>
             <w:tcBorders>
               <w:top w:val="single" w:color="808080" w:sz="4"/>
               <w:left w:val="single" w:color="808080" w:sz="4"/>
@@ -5468,7 +5705,7 @@
         </w:tc>
         <w:tc>
           <w:tcPr>
-            <w:tcW w:type="dxa" w:w="2465"/>
+            <w:tcW w:type="dxa" w:w="2294"/>
             <w:tcBorders>
               <w:top w:val="single" w:color="808080" w:sz="4"/>
               <w:left w:val="single" w:color="808080" w:sz="4"/>
@@ -5563,7 +5800,7 @@
         </w:tc>
         <w:tc>
           <w:tcPr>
-            <w:tcW w:type="dxa" w:w="3109"/>
+            <w:tcW w:type="dxa" w:w="2972"/>
             <w:tcBorders>
               <w:top w:val="single" w:color="808080" w:sz="4"/>
               <w:left w:val="single" w:color="808080" w:sz="4"/>
@@ -5593,7 +5830,7 @@
         </w:tc>
         <w:tc>
           <w:tcPr>
-            <w:tcW w:type="dxa" w:w="2664"/>
+            <w:tcW w:type="dxa" w:w="2972"/>
             <w:tcBorders>
               <w:top w:val="single" w:color="808080" w:sz="4"/>
               <w:left w:val="single" w:color="808080" w:sz="4"/>
@@ -5623,7 +5860,7 @@
         </w:tc>
         <w:tc>
           <w:tcPr>
-            <w:tcW w:type="dxa" w:w="2465"/>
+            <w:tcW w:type="dxa" w:w="2294"/>
             <w:tcBorders>
               <w:top w:val="single" w:color="808080" w:sz="4"/>
               <w:left w:val="single" w:color="808080" w:sz="4"/>
@@ -5715,7 +5952,7 @@
         </w:tc>
         <w:tc>
           <w:tcPr>
-            <w:tcW w:type="dxa" w:w="3109"/>
+            <w:tcW w:type="dxa" w:w="2972"/>
             <w:tcBorders>
               <w:top w:val="single" w:color="808080" w:sz="4"/>
               <w:left w:val="single" w:color="808080" w:sz="4"/>
@@ -5745,7 +5982,7 @@
         </w:tc>
         <w:tc>
           <w:tcPr>
-            <w:tcW w:type="dxa" w:w="2664"/>
+            <w:tcW w:type="dxa" w:w="2972"/>
             <w:tcBorders>
               <w:top w:val="single" w:color="808080" w:sz="4"/>
               <w:left w:val="single" w:color="808080" w:sz="4"/>
@@ -5775,7 +6012,7 @@
         </w:tc>
         <w:tc>
           <w:tcPr>
-            <w:tcW w:type="dxa" w:w="2465"/>
+            <w:tcW w:type="dxa" w:w="2294"/>
             <w:tcBorders>
               <w:top w:val="single" w:color="808080" w:sz="4"/>
               <w:left w:val="single" w:color="808080" w:sz="4"/>
@@ -5867,7 +6104,7 @@
         </w:tc>
         <w:tc>
           <w:tcPr>
-            <w:tcW w:type="dxa" w:w="3109"/>
+            <w:tcW w:type="dxa" w:w="2972"/>
             <w:tcBorders>
               <w:top w:val="single" w:color="808080" w:sz="4"/>
               <w:left w:val="single" w:color="808080" w:sz="4"/>
@@ -5897,7 +6134,7 @@
         </w:tc>
         <w:tc>
           <w:tcPr>
-            <w:tcW w:type="dxa" w:w="2664"/>
+            <w:tcW w:type="dxa" w:w="2972"/>
             <w:tcBorders>
               <w:top w:val="single" w:color="808080" w:sz="4"/>
               <w:left w:val="single" w:color="808080" w:sz="4"/>
@@ -5927,7 +6164,7 @@
         </w:tc>
         <w:tc>
           <w:tcPr>
-            <w:tcW w:type="dxa" w:w="2465"/>
+            <w:tcW w:type="dxa" w:w="2294"/>
             <w:tcBorders>
               <w:top w:val="single" w:color="808080" w:sz="4"/>
               <w:left w:val="single" w:color="808080" w:sz="4"/>
@@ -6019,7 +6256,7 @@
         </w:tc>
         <w:tc>
           <w:tcPr>
-            <w:tcW w:type="dxa" w:w="3109"/>
+            <w:tcW w:type="dxa" w:w="2972"/>
             <w:tcBorders>
               <w:top w:val="single" w:color="808080" w:sz="4"/>
               <w:left w:val="single" w:color="808080" w:sz="4"/>
@@ -6049,7 +6286,7 @@
         </w:tc>
         <w:tc>
           <w:tcPr>
-            <w:tcW w:type="dxa" w:w="2664"/>
+            <w:tcW w:type="dxa" w:w="2972"/>
             <w:tcBorders>
               <w:top w:val="single" w:color="808080" w:sz="4"/>
               <w:left w:val="single" w:color="808080" w:sz="4"/>
@@ -6079,7 +6316,7 @@
         </w:tc>
         <w:tc>
           <w:tcPr>
-            <w:tcW w:type="dxa" w:w="2465"/>
+            <w:tcW w:type="dxa" w:w="2294"/>
             <w:tcBorders>
               <w:top w:val="single" w:color="808080" w:sz="4"/>
               <w:left w:val="single" w:color="808080" w:sz="4"/>
@@ -6171,7 +6408,7 @@
         </w:tc>
         <w:tc>
           <w:tcPr>
-            <w:tcW w:type="dxa" w:w="3109"/>
+            <w:tcW w:type="dxa" w:w="2972"/>
             <w:tcBorders>
               <w:top w:val="single" w:color="808080" w:sz="4"/>
               <w:left w:val="single" w:color="808080" w:sz="4"/>
@@ -6201,7 +6438,7 @@
         </w:tc>
         <w:tc>
           <w:tcPr>
-            <w:tcW w:type="dxa" w:w="2664"/>
+            <w:tcW w:type="dxa" w:w="2972"/>
             <w:tcBorders>
               <w:top w:val="single" w:color="808080" w:sz="4"/>
               <w:left w:val="single" w:color="808080" w:sz="4"/>
@@ -6231,31 +6468,31 @@
         </w:tc>
         <w:tc>
           <w:tcPr>
-            <w:tcW w:type="dxa" w:w="2465"/>
-            <w:tcBorders>
-              <w:top w:val="single" w:color="808080" w:sz="4"/>
-              <w:left w:val="single" w:color="808080" w:sz="4"/>
-              <w:bottom w:val="single" w:color="808080" w:sz="4"/>
-              <w:right w:val="single" w:color="808080" w:sz="4"/>
-            </w:tcBorders>
-            <w:tcMar>
-              <w:top w:type="dxa" w:w="60"/>
-              <w:left w:type="dxa" w:w="100"/>
-              <w:bottom w:type="dxa" w:w="60"/>
-              <w:right w:type="dxa" w:w="100"/>
-            </w:tcMar>
-          </w:tcPr>
-          <w:p>
-            <w:pPr>
-              <w:spacing w:before="0" w:after="0"/>
-            </w:pPr>
-            <w:r>
-              <w:rPr>
-                <w:rFonts w:ascii="Arial" w:cs="Arial" w:eastAsia="Arial" w:hAnsi="Arial"/>
-                <w:sz w:val="21"/>
-                <w:szCs w:val="21"/>
-              </w:rPr>
-              <w:t xml:space="preserve">Ô "Khu vực" giữ K1 như hiện nay</w:t>
+            <w:tcW w:type="dxa" w:w="2294"/>
+            <w:tcBorders>
+              <w:top w:val="single" w:color="808080" w:sz="4"/>
+              <w:left w:val="single" w:color="808080" w:sz="4"/>
+              <w:bottom w:val="single" w:color="808080" w:sz="4"/>
+              <w:right w:val="single" w:color="808080" w:sz="4"/>
+            </w:tcBorders>
+            <w:tcMar>
+              <w:top w:type="dxa" w:w="60"/>
+              <w:left w:type="dxa" w:w="100"/>
+              <w:bottom w:type="dxa" w:w="60"/>
+              <w:right w:type="dxa" w:w="100"/>
+            </w:tcMar>
+          </w:tcPr>
+          <w:p>
+            <w:pPr>
+              <w:spacing w:before="0" w:after="0"/>
+            </w:pPr>
+            <w:r>
+              <w:rPr>
+                <w:rFonts w:ascii="Arial" w:cs="Arial" w:eastAsia="Arial" w:hAnsi="Arial"/>
+                <w:sz w:val="21"/>
+                <w:szCs w:val="21"/>
+              </w:rPr>
+              <w:t xml:space="preserve">Ô "Khu vực" trống</w:t>
             </w:r>
           </w:p>
         </w:tc>
@@ -6287,7 +6524,7 @@
                 <w:sz w:val="21"/>
                 <w:szCs w:val="21"/>
               </w:rPr>
-              <w:t xml:space="preserve">6</w:t>
+              <w:t xml:space="preserve">5a</w:t>
             </w:r>
           </w:p>
         </w:tc>
@@ -6323,37 +6560,37 @@
         </w:tc>
         <w:tc>
           <w:tcPr>
-            <w:tcW w:type="dxa" w:w="3109"/>
-            <w:tcBorders>
-              <w:top w:val="single" w:color="808080" w:sz="4"/>
-              <w:left w:val="single" w:color="808080" w:sz="4"/>
-              <w:bottom w:val="single" w:color="808080" w:sz="4"/>
-              <w:right w:val="single" w:color="808080" w:sz="4"/>
-            </w:tcBorders>
-            <w:tcMar>
-              <w:top w:type="dxa" w:w="60"/>
-              <w:left w:type="dxa" w:w="100"/>
-              <w:bottom w:type="dxa" w:w="60"/>
-              <w:right w:type="dxa" w:w="100"/>
-            </w:tcMar>
-          </w:tcPr>
-          <w:p>
-            <w:pPr>
-              <w:spacing w:before="0" w:after="0"/>
-            </w:pPr>
-            <w:r>
-              <w:rPr>
-                <w:rFonts w:ascii="Arial" w:cs="Arial" w:eastAsia="Arial" w:hAnsi="Arial"/>
-                <w:sz w:val="21"/>
-                <w:szCs w:val="21"/>
-              </w:rPr>
-              <w:t xml:space="preserve">Người bệnh cũ K1, trước đây đúng tuyến nhờ khu vực; thẻ không có khu vực</w:t>
-            </w:r>
-          </w:p>
-        </w:tc>
-        <w:tc>
-          <w:tcPr>
-            <w:tcW w:type="dxa" w:w="2664"/>
+            <w:tcW w:type="dxa" w:w="2972"/>
+            <w:tcBorders>
+              <w:top w:val="single" w:color="808080" w:sz="4"/>
+              <w:left w:val="single" w:color="808080" w:sz="4"/>
+              <w:bottom w:val="single" w:color="808080" w:sz="4"/>
+              <w:right w:val="single" w:color="808080" w:sz="4"/>
+            </w:tcBorders>
+            <w:tcMar>
+              <w:top w:type="dxa" w:w="60"/>
+              <w:left w:type="dxa" w:w="100"/>
+              <w:bottom w:type="dxa" w:w="60"/>
+              <w:right w:type="dxa" w:w="100"/>
+            </w:tcMar>
+          </w:tcPr>
+          <w:p>
+            <w:pPr>
+              <w:spacing w:before="0" w:after="0"/>
+            </w:pPr>
+            <w:r>
+              <w:rPr>
+                <w:rFonts w:ascii="Arial" w:cs="Arial" w:eastAsia="Arial" w:hAnsi="Arial"/>
+                <w:sz w:val="21"/>
+                <w:szCs w:val="21"/>
+              </w:rPr>
+              <w:t xml:space="preserve">Người bệnh cũ K1; cổng báo thẻ không tồn tại / sai thông tin</w:t>
+            </w:r>
+          </w:p>
+        </w:tc>
+        <w:tc>
+          <w:tcPr>
+            <w:tcW w:type="dxa" w:w="2972"/>
             <w:tcBorders>
               <w:top w:val="single" w:color="808080" w:sz="4"/>
               <w:left w:val="single" w:color="808080" w:sz="4"/>
@@ -6383,31 +6620,31 @@
         </w:tc>
         <w:tc>
           <w:tcPr>
-            <w:tcW w:type="dxa" w:w="2465"/>
-            <w:tcBorders>
-              <w:top w:val="single" w:color="808080" w:sz="4"/>
-              <w:left w:val="single" w:color="808080" w:sz="4"/>
-              <w:bottom w:val="single" w:color="808080" w:sz="4"/>
-              <w:right w:val="single" w:color="808080" w:sz="4"/>
-            </w:tcBorders>
-            <w:tcMar>
-              <w:top w:type="dxa" w:w="60"/>
-              <w:left w:type="dxa" w:w="100"/>
-              <w:bottom w:type="dxa" w:w="60"/>
-              <w:right w:type="dxa" w:w="100"/>
-            </w:tcMar>
-          </w:tcPr>
-          <w:p>
-            <w:pPr>
-              <w:spacing w:before="0" w:after="0"/>
-            </w:pPr>
-            <w:r>
-              <w:rPr>
-                <w:rFonts w:ascii="Arial" w:cs="Arial" w:eastAsia="Arial" w:hAnsi="Arial"/>
-                <w:sz w:val="21"/>
-                <w:szCs w:val="21"/>
-              </w:rPr>
-              <w:t xml:space="preserve">Tuyến được tính lại theo nơi đăng ký KCB ban đầu; mức hưởng thay đổi tương ứng</w:t>
+            <w:tcW w:type="dxa" w:w="2294"/>
+            <w:tcBorders>
+              <w:top w:val="single" w:color="808080" w:sz="4"/>
+              <w:left w:val="single" w:color="808080" w:sz="4"/>
+              <w:bottom w:val="single" w:color="808080" w:sz="4"/>
+              <w:right w:val="single" w:color="808080" w:sz="4"/>
+            </w:tcBorders>
+            <w:tcMar>
+              <w:top w:type="dxa" w:w="60"/>
+              <w:left w:type="dxa" w:w="100"/>
+              <w:bottom w:type="dxa" w:w="60"/>
+              <w:right w:type="dxa" w:w="100"/>
+            </w:tcMar>
+          </w:tcPr>
+          <w:p>
+            <w:pPr>
+              <w:spacing w:before="0" w:after="0"/>
+            </w:pPr>
+            <w:r>
+              <w:rPr>
+                <w:rFonts w:ascii="Arial" w:cs="Arial" w:eastAsia="Arial" w:hAnsi="Arial"/>
+                <w:sz w:val="21"/>
+                <w:szCs w:val="21"/>
+              </w:rPr>
+              <w:t xml:space="preserve">Ô "Khu vực" trống</w:t>
             </w:r>
           </w:p>
         </w:tc>
@@ -6439,7 +6676,7 @@
                 <w:sz w:val="21"/>
                 <w:szCs w:val="21"/>
               </w:rPr>
-              <w:t xml:space="preserve">7</w:t>
+              <w:t xml:space="preserve">5b</w:t>
             </w:r>
           </w:p>
         </w:tc>
@@ -6475,91 +6712,91 @@
         </w:tc>
         <w:tc>
           <w:tcPr>
-            <w:tcW w:type="dxa" w:w="3109"/>
-            <w:tcBorders>
-              <w:top w:val="single" w:color="808080" w:sz="4"/>
-              <w:left w:val="single" w:color="808080" w:sz="4"/>
-              <w:bottom w:val="single" w:color="808080" w:sz="4"/>
-              <w:right w:val="single" w:color="808080" w:sz="4"/>
-            </w:tcBorders>
-            <w:tcMar>
-              <w:top w:type="dxa" w:w="60"/>
-              <w:left w:type="dxa" w:w="100"/>
-              <w:bottom w:type="dxa" w:w="60"/>
-              <w:right w:type="dxa" w:w="100"/>
-            </w:tcMar>
-          </w:tcPr>
-          <w:p>
-            <w:pPr>
-              <w:spacing w:before="0" w:after="0"/>
-            </w:pPr>
-            <w:r>
-              <w:rPr>
-                <w:rFonts w:ascii="Arial" w:cs="Arial" w:eastAsia="Arial" w:hAnsi="Arial"/>
-                <w:sz w:val="21"/>
-                <w:szCs w:val="21"/>
-              </w:rPr>
-              <w:t xml:space="preserve">Người bệnh cũ K1; thẻ không có khu vực</w:t>
-            </w:r>
-          </w:p>
-        </w:tc>
-        <w:tc>
-          <w:tcPr>
-            <w:tcW w:type="dxa" w:w="2664"/>
-            <w:tcBorders>
-              <w:top w:val="single" w:color="808080" w:sz="4"/>
-              <w:left w:val="single" w:color="808080" w:sz="4"/>
-              <w:bottom w:val="single" w:color="808080" w:sz="4"/>
-              <w:right w:val="single" w:color="808080" w:sz="4"/>
-            </w:tcBorders>
-            <w:tcMar>
-              <w:top w:type="dxa" w:w="60"/>
-              <w:left w:type="dxa" w:w="100"/>
-              <w:bottom w:type="dxa" w:w="60"/>
-              <w:right w:type="dxa" w:w="100"/>
-            </w:tcMar>
-          </w:tcPr>
-          <w:p>
-            <w:pPr>
-              <w:spacing w:before="0" w:after="0"/>
-            </w:pPr>
-            <w:r>
-              <w:rPr>
-                <w:rFonts w:ascii="Arial" w:cs="Arial" w:eastAsia="Arial" w:hAnsi="Arial"/>
-                <w:sz w:val="21"/>
-                <w:szCs w:val="21"/>
-              </w:rPr>
-              <w:t xml:space="preserve">Quét QR thẻ BHYT / quét CCCD / tự chuyển sang đối tượng BHYT</w:t>
-            </w:r>
-          </w:p>
-        </w:tc>
-        <w:tc>
-          <w:tcPr>
-            <w:tcW w:type="dxa" w:w="2465"/>
-            <w:tcBorders>
-              <w:top w:val="single" w:color="808080" w:sz="4"/>
-              <w:left w:val="single" w:color="808080" w:sz="4"/>
-              <w:bottom w:val="single" w:color="808080" w:sz="4"/>
-              <w:right w:val="single" w:color="808080" w:sz="4"/>
-            </w:tcBorders>
-            <w:tcMar>
-              <w:top w:type="dxa" w:w="60"/>
-              <w:left w:type="dxa" w:w="100"/>
-              <w:bottom w:type="dxa" w:w="60"/>
-              <w:right w:type="dxa" w:w="100"/>
-            </w:tcMar>
-          </w:tcPr>
-          <w:p>
-            <w:pPr>
-              <w:spacing w:before="0" w:after="0"/>
-            </w:pPr>
-            <w:r>
-              <w:rPr>
-                <w:rFonts w:ascii="Arial" w:cs="Arial" w:eastAsia="Arial" w:hAnsi="Arial"/>
-                <w:sz w:val="21"/>
-                <w:szCs w:val="21"/>
-              </w:rPr>
-              <w:t xml:space="preserve">Như kịch bản 1</w:t>
+            <w:tcW w:type="dxa" w:w="2972"/>
+            <w:tcBorders>
+              <w:top w:val="single" w:color="808080" w:sz="4"/>
+              <w:left w:val="single" w:color="808080" w:sz="4"/>
+              <w:bottom w:val="single" w:color="808080" w:sz="4"/>
+              <w:right w:val="single" w:color="808080" w:sz="4"/>
+            </w:tcBorders>
+            <w:tcMar>
+              <w:top w:type="dxa" w:w="60"/>
+              <w:left w:type="dxa" w:w="100"/>
+              <w:bottom w:type="dxa" w:w="60"/>
+              <w:right w:type="dxa" w:w="100"/>
+            </w:tcMar>
+          </w:tcPr>
+          <w:p>
+            <w:pPr>
+              <w:spacing w:before="0" w:after="0"/>
+            </w:pPr>
+            <w:r>
+              <w:rPr>
+                <w:rFonts w:ascii="Arial" w:cs="Arial" w:eastAsia="Arial" w:hAnsi="Arial"/>
+                <w:sz w:val="21"/>
+                <w:szCs w:val="21"/>
+              </w:rPr>
+              <w:t xml:space="preserve">Người bệnh cũ K1; đầu thẻ thuộc danh mục không kiểm tra trên cổng</w:t>
+            </w:r>
+          </w:p>
+        </w:tc>
+        <w:tc>
+          <w:tcPr>
+            <w:tcW w:type="dxa" w:w="2972"/>
+            <w:tcBorders>
+              <w:top w:val="single" w:color="808080" w:sz="4"/>
+              <w:left w:val="single" w:color="808080" w:sz="4"/>
+              <w:bottom w:val="single" w:color="808080" w:sz="4"/>
+              <w:right w:val="single" w:color="808080" w:sz="4"/>
+            </w:tcBorders>
+            <w:tcMar>
+              <w:top w:type="dxa" w:w="60"/>
+              <w:left w:type="dxa" w:w="100"/>
+              <w:bottom w:type="dxa" w:w="60"/>
+              <w:right w:type="dxa" w:w="100"/>
+            </w:tcMar>
+          </w:tcPr>
+          <w:p>
+            <w:pPr>
+              <w:spacing w:before="0" w:after="0"/>
+            </w:pPr>
+            <w:r>
+              <w:rPr>
+                <w:rFonts w:ascii="Arial" w:cs="Arial" w:eastAsia="Arial" w:hAnsi="Arial"/>
+                <w:sz w:val="21"/>
+                <w:szCs w:val="21"/>
+              </w:rPr>
+              <w:t xml:space="preserve">Kiểm tra thẻ</w:t>
+            </w:r>
+          </w:p>
+        </w:tc>
+        <w:tc>
+          <w:tcPr>
+            <w:tcW w:type="dxa" w:w="2294"/>
+            <w:tcBorders>
+              <w:top w:val="single" w:color="808080" w:sz="4"/>
+              <w:left w:val="single" w:color="808080" w:sz="4"/>
+              <w:bottom w:val="single" w:color="808080" w:sz="4"/>
+              <w:right w:val="single" w:color="808080" w:sz="4"/>
+            </w:tcBorders>
+            <w:tcMar>
+              <w:top w:type="dxa" w:w="60"/>
+              <w:left w:type="dxa" w:w="100"/>
+              <w:bottom w:type="dxa" w:w="60"/>
+              <w:right w:type="dxa" w:w="100"/>
+            </w:tcMar>
+          </w:tcPr>
+          <w:p>
+            <w:pPr>
+              <w:spacing w:before="0" w:after="0"/>
+            </w:pPr>
+            <w:r>
+              <w:rPr>
+                <w:rFonts w:ascii="Arial" w:cs="Arial" w:eastAsia="Arial" w:hAnsi="Arial"/>
+                <w:sz w:val="21"/>
+                <w:szCs w:val="21"/>
+              </w:rPr>
+              <w:t xml:space="preserve">Ô "Khu vực" giữ K1</w:t>
             </w:r>
           </w:p>
         </w:tc>
@@ -6591,7 +6828,7 @@
                 <w:sz w:val="21"/>
                 <w:szCs w:val="21"/>
               </w:rPr>
-              <w:t xml:space="preserve">8</w:t>
+              <w:t xml:space="preserve">6</w:t>
             </w:r>
           </w:p>
         </w:tc>
@@ -6627,91 +6864,91 @@
         </w:tc>
         <w:tc>
           <w:tcPr>
-            <w:tcW w:type="dxa" w:w="3109"/>
-            <w:tcBorders>
-              <w:top w:val="single" w:color="808080" w:sz="4"/>
-              <w:left w:val="single" w:color="808080" w:sz="4"/>
-              <w:bottom w:val="single" w:color="808080" w:sz="4"/>
-              <w:right w:val="single" w:color="808080" w:sz="4"/>
-            </w:tcBorders>
-            <w:tcMar>
-              <w:top w:type="dxa" w:w="60"/>
-              <w:left w:type="dxa" w:w="100"/>
-              <w:bottom w:type="dxa" w:w="60"/>
-              <w:right w:type="dxa" w:w="100"/>
-            </w:tcMar>
-          </w:tcPr>
-          <w:p>
-            <w:pPr>
-              <w:spacing w:before="0" w:after="0"/>
-            </w:pPr>
-            <w:r>
-              <w:rPr>
-                <w:rFonts w:ascii="Arial" w:cs="Arial" w:eastAsia="Arial" w:hAnsi="Arial"/>
-                <w:sz w:val="21"/>
-                <w:szCs w:val="21"/>
-              </w:rPr>
-              <w:t xml:space="preserve">Như kịch bản 1</w:t>
-            </w:r>
-          </w:p>
-        </w:tc>
-        <w:tc>
-          <w:tcPr>
-            <w:tcW w:type="dxa" w:w="2664"/>
-            <w:tcBorders>
-              <w:top w:val="single" w:color="808080" w:sz="4"/>
-              <w:left w:val="single" w:color="808080" w:sz="4"/>
-              <w:bottom w:val="single" w:color="808080" w:sz="4"/>
-              <w:right w:val="single" w:color="808080" w:sz="4"/>
-            </w:tcBorders>
-            <w:tcMar>
-              <w:top w:type="dxa" w:w="60"/>
-              <w:left w:type="dxa" w:w="100"/>
-              <w:bottom w:type="dxa" w:w="60"/>
-              <w:right w:type="dxa" w:w="100"/>
-            </w:tcMar>
-          </w:tcPr>
-          <w:p>
-            <w:pPr>
-              <w:spacing w:before="0" w:after="0"/>
-            </w:pPr>
-            <w:r>
-              <w:rPr>
-                <w:rFonts w:ascii="Arial" w:cs="Arial" w:eastAsia="Arial" w:hAnsi="Arial"/>
-                <w:sz w:val="21"/>
-                <w:szCs w:val="21"/>
-              </w:rPr>
-              <w:t xml:space="preserve">Sau khi ô trống, nhân viên tự chọn K1 rồi Lưu</w:t>
-            </w:r>
-          </w:p>
-        </w:tc>
-        <w:tc>
-          <w:tcPr>
-            <w:tcW w:type="dxa" w:w="2465"/>
-            <w:tcBorders>
-              <w:top w:val="single" w:color="808080" w:sz="4"/>
-              <w:left w:val="single" w:color="808080" w:sz="4"/>
-              <w:bottom w:val="single" w:color="808080" w:sz="4"/>
-              <w:right w:val="single" w:color="808080" w:sz="4"/>
-            </w:tcBorders>
-            <w:tcMar>
-              <w:top w:type="dxa" w:w="60"/>
-              <w:left w:type="dxa" w:w="100"/>
-              <w:bottom w:type="dxa" w:w="60"/>
-              <w:right w:type="dxa" w:w="100"/>
-            </w:tcMar>
-          </w:tcPr>
-          <w:p>
-            <w:pPr>
-              <w:spacing w:before="0" w:after="0"/>
-            </w:pPr>
-            <w:r>
-              <w:rPr>
-                <w:rFonts w:ascii="Arial" w:cs="Arial" w:eastAsia="Arial" w:hAnsi="Arial"/>
-                <w:sz w:val="21"/>
-                <w:szCs w:val="21"/>
-              </w:rPr>
-              <w:t xml:space="preserve">Lưu với K1 theo lựa chọn của nhân viên</w:t>
+            <w:tcW w:type="dxa" w:w="2972"/>
+            <w:tcBorders>
+              <w:top w:val="single" w:color="808080" w:sz="4"/>
+              <w:left w:val="single" w:color="808080" w:sz="4"/>
+              <w:bottom w:val="single" w:color="808080" w:sz="4"/>
+              <w:right w:val="single" w:color="808080" w:sz="4"/>
+            </w:tcBorders>
+            <w:tcMar>
+              <w:top w:type="dxa" w:w="60"/>
+              <w:left w:type="dxa" w:w="100"/>
+              <w:bottom w:type="dxa" w:w="60"/>
+              <w:right w:type="dxa" w:w="100"/>
+            </w:tcMar>
+          </w:tcPr>
+          <w:p>
+            <w:pPr>
+              <w:spacing w:before="0" w:after="0"/>
+            </w:pPr>
+            <w:r>
+              <w:rPr>
+                <w:rFonts w:ascii="Arial" w:cs="Arial" w:eastAsia="Arial" w:hAnsi="Arial"/>
+                <w:sz w:val="21"/>
+                <w:szCs w:val="21"/>
+              </w:rPr>
+              <w:t xml:space="preserve">Người bệnh cũ K1, trước đây đúng tuyến nhờ khu vực; thẻ không có khu vực</w:t>
+            </w:r>
+          </w:p>
+        </w:tc>
+        <w:tc>
+          <w:tcPr>
+            <w:tcW w:type="dxa" w:w="2972"/>
+            <w:tcBorders>
+              <w:top w:val="single" w:color="808080" w:sz="4"/>
+              <w:left w:val="single" w:color="808080" w:sz="4"/>
+              <w:bottom w:val="single" w:color="808080" w:sz="4"/>
+              <w:right w:val="single" w:color="808080" w:sz="4"/>
+            </w:tcBorders>
+            <w:tcMar>
+              <w:top w:type="dxa" w:w="60"/>
+              <w:left w:type="dxa" w:w="100"/>
+              <w:bottom w:type="dxa" w:w="60"/>
+              <w:right w:type="dxa" w:w="100"/>
+            </w:tcMar>
+          </w:tcPr>
+          <w:p>
+            <w:pPr>
+              <w:spacing w:before="0" w:after="0"/>
+            </w:pPr>
+            <w:r>
+              <w:rPr>
+                <w:rFonts w:ascii="Arial" w:cs="Arial" w:eastAsia="Arial" w:hAnsi="Arial"/>
+                <w:sz w:val="21"/>
+                <w:szCs w:val="21"/>
+              </w:rPr>
+              <w:t xml:space="preserve">Kiểm tra thẻ</w:t>
+            </w:r>
+          </w:p>
+        </w:tc>
+        <w:tc>
+          <w:tcPr>
+            <w:tcW w:type="dxa" w:w="2294"/>
+            <w:tcBorders>
+              <w:top w:val="single" w:color="808080" w:sz="4"/>
+              <w:left w:val="single" w:color="808080" w:sz="4"/>
+              <w:bottom w:val="single" w:color="808080" w:sz="4"/>
+              <w:right w:val="single" w:color="808080" w:sz="4"/>
+            </w:tcBorders>
+            <w:tcMar>
+              <w:top w:type="dxa" w:w="60"/>
+              <w:left w:type="dxa" w:w="100"/>
+              <w:bottom w:type="dxa" w:w="60"/>
+              <w:right w:type="dxa" w:w="100"/>
+            </w:tcMar>
+          </w:tcPr>
+          <w:p>
+            <w:pPr>
+              <w:spacing w:before="0" w:after="0"/>
+            </w:pPr>
+            <w:r>
+              <w:rPr>
+                <w:rFonts w:ascii="Arial" w:cs="Arial" w:eastAsia="Arial" w:hAnsi="Arial"/>
+                <w:sz w:val="21"/>
+                <w:szCs w:val="21"/>
+              </w:rPr>
+              <w:t xml:space="preserve">Tuyến được tính lại theo nơi đăng ký KCB ban đầu; mức hưởng thay đổi tương ứng</w:t>
             </w:r>
           </w:p>
         </w:tc>
@@ -6743,7 +6980,7 @@
                 <w:sz w:val="21"/>
                 <w:szCs w:val="21"/>
               </w:rPr>
-              <w:t xml:space="preserve">9</w:t>
+              <w:t xml:space="preserve">7</w:t>
             </w:r>
           </w:p>
         </w:tc>
@@ -6779,91 +7016,91 @@
         </w:tc>
         <w:tc>
           <w:tcPr>
-            <w:tcW w:type="dxa" w:w="3109"/>
-            <w:tcBorders>
-              <w:top w:val="single" w:color="808080" w:sz="4"/>
-              <w:left w:val="single" w:color="808080" w:sz="4"/>
-              <w:bottom w:val="single" w:color="808080" w:sz="4"/>
-              <w:right w:val="single" w:color="808080" w:sz="4"/>
-            </w:tcBorders>
-            <w:tcMar>
-              <w:top w:type="dxa" w:w="60"/>
-              <w:left w:type="dxa" w:w="100"/>
-              <w:bottom w:type="dxa" w:w="60"/>
-              <w:right w:type="dxa" w:w="100"/>
-            </w:tcMar>
-          </w:tcPr>
-          <w:p>
-            <w:pPr>
-              <w:spacing w:before="0" w:after="0"/>
-            </w:pPr>
-            <w:r>
-              <w:rPr>
-                <w:rFonts w:ascii="Arial" w:cs="Arial" w:eastAsia="Arial" w:hAnsi="Arial"/>
-                <w:sz w:val="21"/>
-                <w:szCs w:val="21"/>
-              </w:rPr>
-              <w:t xml:space="preserve">Đối tượng viện phí (không dùng thẻ)</w:t>
-            </w:r>
-          </w:p>
-        </w:tc>
-        <w:tc>
-          <w:tcPr>
-            <w:tcW w:type="dxa" w:w="2664"/>
-            <w:tcBorders>
-              <w:top w:val="single" w:color="808080" w:sz="4"/>
-              <w:left w:val="single" w:color="808080" w:sz="4"/>
-              <w:bottom w:val="single" w:color="808080" w:sz="4"/>
-              <w:right w:val="single" w:color="808080" w:sz="4"/>
-            </w:tcBorders>
-            <w:tcMar>
-              <w:top w:type="dxa" w:w="60"/>
-              <w:left w:type="dxa" w:w="100"/>
-              <w:bottom w:type="dxa" w:w="60"/>
-              <w:right w:type="dxa" w:w="100"/>
-            </w:tcMar>
-          </w:tcPr>
-          <w:p>
-            <w:pPr>
-              <w:spacing w:before="0" w:after="0"/>
-            </w:pPr>
-            <w:r>
-              <w:rPr>
-                <w:rFonts w:ascii="Arial" w:cs="Arial" w:eastAsia="Arial" w:hAnsi="Arial"/>
-                <w:sz w:val="21"/>
-                <w:szCs w:val="21"/>
-              </w:rPr>
-              <w:t xml:space="preserve">Tìm người bệnh cũ</w:t>
-            </w:r>
-          </w:p>
-        </w:tc>
-        <w:tc>
-          <w:tcPr>
-            <w:tcW w:type="dxa" w:w="2465"/>
-            <w:tcBorders>
-              <w:top w:val="single" w:color="808080" w:sz="4"/>
-              <w:left w:val="single" w:color="808080" w:sz="4"/>
-              <w:bottom w:val="single" w:color="808080" w:sz="4"/>
-              <w:right w:val="single" w:color="808080" w:sz="4"/>
-            </w:tcBorders>
-            <w:tcMar>
-              <w:top w:type="dxa" w:w="60"/>
-              <w:left w:type="dxa" w:w="100"/>
-              <w:bottom w:type="dxa" w:w="60"/>
-              <w:right w:type="dxa" w:w="100"/>
-            </w:tcMar>
-          </w:tcPr>
-          <w:p>
-            <w:pPr>
-              <w:spacing w:before="0" w:after="0"/>
-            </w:pPr>
-            <w:r>
-              <w:rPr>
-                <w:rFonts w:ascii="Arial" w:cs="Arial" w:eastAsia="Arial" w:hAnsi="Arial"/>
-                <w:sz w:val="21"/>
-                <w:szCs w:val="21"/>
-              </w:rPr>
-              <w:t xml:space="preserve">Không xử lý khu vực</w:t>
+            <w:tcW w:type="dxa" w:w="2972"/>
+            <w:tcBorders>
+              <w:top w:val="single" w:color="808080" w:sz="4"/>
+              <w:left w:val="single" w:color="808080" w:sz="4"/>
+              <w:bottom w:val="single" w:color="808080" w:sz="4"/>
+              <w:right w:val="single" w:color="808080" w:sz="4"/>
+            </w:tcBorders>
+            <w:tcMar>
+              <w:top w:type="dxa" w:w="60"/>
+              <w:left w:type="dxa" w:w="100"/>
+              <w:bottom w:type="dxa" w:w="60"/>
+              <w:right w:type="dxa" w:w="100"/>
+            </w:tcMar>
+          </w:tcPr>
+          <w:p>
+            <w:pPr>
+              <w:spacing w:before="0" w:after="0"/>
+            </w:pPr>
+            <w:r>
+              <w:rPr>
+                <w:rFonts w:ascii="Arial" w:cs="Arial" w:eastAsia="Arial" w:hAnsi="Arial"/>
+                <w:sz w:val="21"/>
+                <w:szCs w:val="21"/>
+              </w:rPr>
+              <w:t xml:space="preserve">Người bệnh cũ K1; thẻ không có khu vực</w:t>
+            </w:r>
+          </w:p>
+        </w:tc>
+        <w:tc>
+          <w:tcPr>
+            <w:tcW w:type="dxa" w:w="2972"/>
+            <w:tcBorders>
+              <w:top w:val="single" w:color="808080" w:sz="4"/>
+              <w:left w:val="single" w:color="808080" w:sz="4"/>
+              <w:bottom w:val="single" w:color="808080" w:sz="4"/>
+              <w:right w:val="single" w:color="808080" w:sz="4"/>
+            </w:tcBorders>
+            <w:tcMar>
+              <w:top w:type="dxa" w:w="60"/>
+              <w:left w:type="dxa" w:w="100"/>
+              <w:bottom w:type="dxa" w:w="60"/>
+              <w:right w:type="dxa" w:w="100"/>
+            </w:tcMar>
+          </w:tcPr>
+          <w:p>
+            <w:pPr>
+              <w:spacing w:before="0" w:after="0"/>
+            </w:pPr>
+            <w:r>
+              <w:rPr>
+                <w:rFonts w:ascii="Arial" w:cs="Arial" w:eastAsia="Arial" w:hAnsi="Arial"/>
+                <w:sz w:val="21"/>
+                <w:szCs w:val="21"/>
+              </w:rPr>
+              <w:t xml:space="preserve">Quét QR thẻ BHYT / quét CCCD / đọc thẻ KCB / tự chuyển sang đối tượng BHYT</w:t>
+            </w:r>
+          </w:p>
+        </w:tc>
+        <w:tc>
+          <w:tcPr>
+            <w:tcW w:type="dxa" w:w="2294"/>
+            <w:tcBorders>
+              <w:top w:val="single" w:color="808080" w:sz="4"/>
+              <w:left w:val="single" w:color="808080" w:sz="4"/>
+              <w:bottom w:val="single" w:color="808080" w:sz="4"/>
+              <w:right w:val="single" w:color="808080" w:sz="4"/>
+            </w:tcBorders>
+            <w:tcMar>
+              <w:top w:type="dxa" w:w="60"/>
+              <w:left w:type="dxa" w:w="100"/>
+              <w:bottom w:type="dxa" w:w="60"/>
+              <w:right w:type="dxa" w:w="100"/>
+            </w:tcMar>
+          </w:tcPr>
+          <w:p>
+            <w:pPr>
+              <w:spacing w:before="0" w:after="0"/>
+            </w:pPr>
+            <w:r>
+              <w:rPr>
+                <w:rFonts w:ascii="Arial" w:cs="Arial" w:eastAsia="Arial" w:hAnsi="Arial"/>
+                <w:sz w:val="21"/>
+                <w:szCs w:val="21"/>
+              </w:rPr>
+              <w:t xml:space="preserve">Như kịch bản 1</w:t>
             </w:r>
           </w:p>
         </w:tc>
@@ -6895,7 +7132,7 @@
                 <w:sz w:val="21"/>
                 <w:szCs w:val="21"/>
               </w:rPr>
-              <w:t xml:space="preserve">10</w:t>
+              <w:t xml:space="preserve">8</w:t>
             </w:r>
           </w:p>
         </w:tc>
@@ -6925,97 +7162,97 @@
                 <w:sz w:val="21"/>
                 <w:szCs w:val="21"/>
               </w:rPr>
-              <w:t xml:space="preserve">Tắt (= 0)</w:t>
-            </w:r>
-          </w:p>
-        </w:tc>
-        <w:tc>
-          <w:tcPr>
-            <w:tcW w:type="dxa" w:w="3109"/>
-            <w:tcBorders>
-              <w:top w:val="single" w:color="808080" w:sz="4"/>
-              <w:left w:val="single" w:color="808080" w:sz="4"/>
-              <w:bottom w:val="single" w:color="808080" w:sz="4"/>
-              <w:right w:val="single" w:color="808080" w:sz="4"/>
-            </w:tcBorders>
-            <w:tcMar>
-              <w:top w:type="dxa" w:w="60"/>
-              <w:left w:type="dxa" w:w="100"/>
-              <w:bottom w:type="dxa" w:w="60"/>
-              <w:right w:type="dxa" w:w="100"/>
-            </w:tcMar>
-          </w:tcPr>
-          <w:p>
-            <w:pPr>
-              <w:spacing w:before="0" w:after="0"/>
-            </w:pPr>
-            <w:r>
-              <w:rPr>
-                <w:rFonts w:ascii="Arial" w:cs="Arial" w:eastAsia="Arial" w:hAnsi="Arial"/>
-                <w:sz w:val="21"/>
-                <w:szCs w:val="21"/>
-              </w:rPr>
-              <w:t xml:space="preserve">Người bệnh cũ K1; thẻ không có khu vực</w:t>
-            </w:r>
-          </w:p>
-        </w:tc>
-        <w:tc>
-          <w:tcPr>
-            <w:tcW w:type="dxa" w:w="2664"/>
-            <w:tcBorders>
-              <w:top w:val="single" w:color="808080" w:sz="4"/>
-              <w:left w:val="single" w:color="808080" w:sz="4"/>
-              <w:bottom w:val="single" w:color="808080" w:sz="4"/>
-              <w:right w:val="single" w:color="808080" w:sz="4"/>
-            </w:tcBorders>
-            <w:tcMar>
-              <w:top w:type="dxa" w:w="60"/>
-              <w:left w:type="dxa" w:w="100"/>
-              <w:bottom w:type="dxa" w:w="60"/>
-              <w:right w:type="dxa" w:w="100"/>
-            </w:tcMar>
-          </w:tcPr>
-          <w:p>
-            <w:pPr>
-              <w:spacing w:before="0" w:after="0"/>
-            </w:pPr>
-            <w:r>
-              <w:rPr>
-                <w:rFonts w:ascii="Arial" w:cs="Arial" w:eastAsia="Arial" w:hAnsi="Arial"/>
-                <w:sz w:val="21"/>
-                <w:szCs w:val="21"/>
-              </w:rPr>
-              <w:t xml:space="preserve">Kiểm tra thẻ, Lưu</w:t>
-            </w:r>
-          </w:p>
-        </w:tc>
-        <w:tc>
-          <w:tcPr>
-            <w:tcW w:type="dxa" w:w="2465"/>
-            <w:tcBorders>
-              <w:top w:val="single" w:color="808080" w:sz="4"/>
-              <w:left w:val="single" w:color="808080" w:sz="4"/>
-              <w:bottom w:val="single" w:color="808080" w:sz="4"/>
-              <w:right w:val="single" w:color="808080" w:sz="4"/>
-            </w:tcBorders>
-            <w:tcMar>
-              <w:top w:type="dxa" w:w="60"/>
-              <w:left w:type="dxa" w:w="100"/>
-              <w:bottom w:type="dxa" w:w="60"/>
-              <w:right w:type="dxa" w:w="100"/>
-            </w:tcMar>
-          </w:tcPr>
-          <w:p>
-            <w:pPr>
-              <w:spacing w:before="0" w:after="0"/>
-            </w:pPr>
-            <w:r>
-              <w:rPr>
-                <w:rFonts w:ascii="Arial" w:cs="Arial" w:eastAsia="Arial" w:hAnsi="Arial"/>
-                <w:sz w:val="21"/>
-                <w:szCs w:val="21"/>
-              </w:rPr>
-              <w:t xml:space="preserve">Giữ K1 như hiện nay</w:t>
+              <w:t xml:space="preserve">Bật</w:t>
+            </w:r>
+          </w:p>
+        </w:tc>
+        <w:tc>
+          <w:tcPr>
+            <w:tcW w:type="dxa" w:w="2972"/>
+            <w:tcBorders>
+              <w:top w:val="single" w:color="808080" w:sz="4"/>
+              <w:left w:val="single" w:color="808080" w:sz="4"/>
+              <w:bottom w:val="single" w:color="808080" w:sz="4"/>
+              <w:right w:val="single" w:color="808080" w:sz="4"/>
+            </w:tcBorders>
+            <w:tcMar>
+              <w:top w:type="dxa" w:w="60"/>
+              <w:left w:type="dxa" w:w="100"/>
+              <w:bottom w:type="dxa" w:w="60"/>
+              <w:right w:type="dxa" w:w="100"/>
+            </w:tcMar>
+          </w:tcPr>
+          <w:p>
+            <w:pPr>
+              <w:spacing w:before="0" w:after="0"/>
+            </w:pPr>
+            <w:r>
+              <w:rPr>
+                <w:rFonts w:ascii="Arial" w:cs="Arial" w:eastAsia="Arial" w:hAnsi="Arial"/>
+                <w:sz w:val="21"/>
+                <w:szCs w:val="21"/>
+              </w:rPr>
+              <w:t xml:space="preserve">Như kịch bản 1</w:t>
+            </w:r>
+          </w:p>
+        </w:tc>
+        <w:tc>
+          <w:tcPr>
+            <w:tcW w:type="dxa" w:w="2972"/>
+            <w:tcBorders>
+              <w:top w:val="single" w:color="808080" w:sz="4"/>
+              <w:left w:val="single" w:color="808080" w:sz="4"/>
+              <w:bottom w:val="single" w:color="808080" w:sz="4"/>
+              <w:right w:val="single" w:color="808080" w:sz="4"/>
+            </w:tcBorders>
+            <w:tcMar>
+              <w:top w:type="dxa" w:w="60"/>
+              <w:left w:type="dxa" w:w="100"/>
+              <w:bottom w:type="dxa" w:w="60"/>
+              <w:right w:type="dxa" w:w="100"/>
+            </w:tcMar>
+          </w:tcPr>
+          <w:p>
+            <w:pPr>
+              <w:spacing w:before="0" w:after="0"/>
+            </w:pPr>
+            <w:r>
+              <w:rPr>
+                <w:rFonts w:ascii="Arial" w:cs="Arial" w:eastAsia="Arial" w:hAnsi="Arial"/>
+                <w:sz w:val="21"/>
+                <w:szCs w:val="21"/>
+              </w:rPr>
+              <w:t xml:space="preserve">Sau khi ô trống, nhân viên tự chọn K1 rồi Lưu</w:t>
+            </w:r>
+          </w:p>
+        </w:tc>
+        <w:tc>
+          <w:tcPr>
+            <w:tcW w:type="dxa" w:w="2294"/>
+            <w:tcBorders>
+              <w:top w:val="single" w:color="808080" w:sz="4"/>
+              <w:left w:val="single" w:color="808080" w:sz="4"/>
+              <w:bottom w:val="single" w:color="808080" w:sz="4"/>
+              <w:right w:val="single" w:color="808080" w:sz="4"/>
+            </w:tcBorders>
+            <w:tcMar>
+              <w:top w:type="dxa" w:w="60"/>
+              <w:left w:type="dxa" w:w="100"/>
+              <w:bottom w:type="dxa" w:w="60"/>
+              <w:right w:type="dxa" w:w="100"/>
+            </w:tcMar>
+          </w:tcPr>
+          <w:p>
+            <w:pPr>
+              <w:spacing w:before="0" w:after="0"/>
+            </w:pPr>
+            <w:r>
+              <w:rPr>
+                <w:rFonts w:ascii="Arial" w:cs="Arial" w:eastAsia="Arial" w:hAnsi="Arial"/>
+                <w:sz w:val="21"/>
+                <w:szCs w:val="21"/>
+              </w:rPr>
+              <w:t xml:space="preserve">Lưu với K1 theo lựa chọn của nhân viên</w:t>
             </w:r>
           </w:p>
         </w:tc>
@@ -7047,7 +7284,7 @@
                 <w:sz w:val="21"/>
                 <w:szCs w:val="21"/>
               </w:rPr>
-              <w:t xml:space="preserve">11</w:t>
+              <w:t xml:space="preserve">9</w:t>
             </w:r>
           </w:p>
         </w:tc>
@@ -7077,97 +7314,97 @@
                 <w:sz w:val="21"/>
                 <w:szCs w:val="21"/>
               </w:rPr>
-              <w:t xml:space="preserve">Chưa khai báo</w:t>
-            </w:r>
-          </w:p>
-        </w:tc>
-        <w:tc>
-          <w:tcPr>
-            <w:tcW w:type="dxa" w:w="3109"/>
-            <w:tcBorders>
-              <w:top w:val="single" w:color="808080" w:sz="4"/>
-              <w:left w:val="single" w:color="808080" w:sz="4"/>
-              <w:bottom w:val="single" w:color="808080" w:sz="4"/>
-              <w:right w:val="single" w:color="808080" w:sz="4"/>
-            </w:tcBorders>
-            <w:tcMar>
-              <w:top w:type="dxa" w:w="60"/>
-              <w:left w:type="dxa" w:w="100"/>
-              <w:bottom w:type="dxa" w:w="60"/>
-              <w:right w:type="dxa" w:w="100"/>
-            </w:tcMar>
-          </w:tcPr>
-          <w:p>
-            <w:pPr>
-              <w:spacing w:before="0" w:after="0"/>
-            </w:pPr>
-            <w:r>
-              <w:rPr>
-                <w:rFonts w:ascii="Arial" w:cs="Arial" w:eastAsia="Arial" w:hAnsi="Arial"/>
-                <w:sz w:val="21"/>
-                <w:szCs w:val="21"/>
-              </w:rPr>
-              <w:t xml:space="preserve">Như kịch bản 10</w:t>
-            </w:r>
-          </w:p>
-        </w:tc>
-        <w:tc>
-          <w:tcPr>
-            <w:tcW w:type="dxa" w:w="2664"/>
-            <w:tcBorders>
-              <w:top w:val="single" w:color="808080" w:sz="4"/>
-              <w:left w:val="single" w:color="808080" w:sz="4"/>
-              <w:bottom w:val="single" w:color="808080" w:sz="4"/>
-              <w:right w:val="single" w:color="808080" w:sz="4"/>
-            </w:tcBorders>
-            <w:tcMar>
-              <w:top w:type="dxa" w:w="60"/>
-              <w:left w:type="dxa" w:w="100"/>
-              <w:bottom w:type="dxa" w:w="60"/>
-              <w:right w:type="dxa" w:w="100"/>
-            </w:tcMar>
-          </w:tcPr>
-          <w:p>
-            <w:pPr>
-              <w:spacing w:before="0" w:after="0"/>
-            </w:pPr>
-            <w:r>
-              <w:rPr>
-                <w:rFonts w:ascii="Arial" w:cs="Arial" w:eastAsia="Arial" w:hAnsi="Arial"/>
-                <w:sz w:val="21"/>
-                <w:szCs w:val="21"/>
-              </w:rPr>
-              <w:t xml:space="preserve">Như kịch bản 10</w:t>
-            </w:r>
-          </w:p>
-        </w:tc>
-        <w:tc>
-          <w:tcPr>
-            <w:tcW w:type="dxa" w:w="2465"/>
-            <w:tcBorders>
-              <w:top w:val="single" w:color="808080" w:sz="4"/>
-              <w:left w:val="single" w:color="808080" w:sz="4"/>
-              <w:bottom w:val="single" w:color="808080" w:sz="4"/>
-              <w:right w:val="single" w:color="808080" w:sz="4"/>
-            </w:tcBorders>
-            <w:tcMar>
-              <w:top w:type="dxa" w:w="60"/>
-              <w:left w:type="dxa" w:w="100"/>
-              <w:bottom w:type="dxa" w:w="60"/>
-              <w:right w:type="dxa" w:w="100"/>
-            </w:tcMar>
-          </w:tcPr>
-          <w:p>
-            <w:pPr>
-              <w:spacing w:before="0" w:after="0"/>
-            </w:pPr>
-            <w:r>
-              <w:rPr>
-                <w:rFonts w:ascii="Arial" w:cs="Arial" w:eastAsia="Arial" w:hAnsi="Arial"/>
-                <w:sz w:val="21"/>
-                <w:szCs w:val="21"/>
-              </w:rPr>
-              <w:t xml:space="preserve">Giữ K1 như hiện nay</w:t>
+              <w:t xml:space="preserve">Bật</w:t>
+            </w:r>
+          </w:p>
+        </w:tc>
+        <w:tc>
+          <w:tcPr>
+            <w:tcW w:type="dxa" w:w="2972"/>
+            <w:tcBorders>
+              <w:top w:val="single" w:color="808080" w:sz="4"/>
+              <w:left w:val="single" w:color="808080" w:sz="4"/>
+              <w:bottom w:val="single" w:color="808080" w:sz="4"/>
+              <w:right w:val="single" w:color="808080" w:sz="4"/>
+            </w:tcBorders>
+            <w:tcMar>
+              <w:top w:type="dxa" w:w="60"/>
+              <w:left w:type="dxa" w:w="100"/>
+              <w:bottom w:type="dxa" w:w="60"/>
+              <w:right w:type="dxa" w:w="100"/>
+            </w:tcMar>
+          </w:tcPr>
+          <w:p>
+            <w:pPr>
+              <w:spacing w:before="0" w:after="0"/>
+            </w:pPr>
+            <w:r>
+              <w:rPr>
+                <w:rFonts w:ascii="Arial" w:cs="Arial" w:eastAsia="Arial" w:hAnsi="Arial"/>
+                <w:sz w:val="21"/>
+                <w:szCs w:val="21"/>
+              </w:rPr>
+              <w:t xml:space="preserve">Đối tượng viện phí (không dùng thẻ)</w:t>
+            </w:r>
+          </w:p>
+        </w:tc>
+        <w:tc>
+          <w:tcPr>
+            <w:tcW w:type="dxa" w:w="2972"/>
+            <w:tcBorders>
+              <w:top w:val="single" w:color="808080" w:sz="4"/>
+              <w:left w:val="single" w:color="808080" w:sz="4"/>
+              <w:bottom w:val="single" w:color="808080" w:sz="4"/>
+              <w:right w:val="single" w:color="808080" w:sz="4"/>
+            </w:tcBorders>
+            <w:tcMar>
+              <w:top w:type="dxa" w:w="60"/>
+              <w:left w:type="dxa" w:w="100"/>
+              <w:bottom w:type="dxa" w:w="60"/>
+              <w:right w:type="dxa" w:w="100"/>
+            </w:tcMar>
+          </w:tcPr>
+          <w:p>
+            <w:pPr>
+              <w:spacing w:before="0" w:after="0"/>
+            </w:pPr>
+            <w:r>
+              <w:rPr>
+                <w:rFonts w:ascii="Arial" w:cs="Arial" w:eastAsia="Arial" w:hAnsi="Arial"/>
+                <w:sz w:val="21"/>
+                <w:szCs w:val="21"/>
+              </w:rPr>
+              <w:t xml:space="preserve">Tìm người bệnh cũ</w:t>
+            </w:r>
+          </w:p>
+        </w:tc>
+        <w:tc>
+          <w:tcPr>
+            <w:tcW w:type="dxa" w:w="2294"/>
+            <w:tcBorders>
+              <w:top w:val="single" w:color="808080" w:sz="4"/>
+              <w:left w:val="single" w:color="808080" w:sz="4"/>
+              <w:bottom w:val="single" w:color="808080" w:sz="4"/>
+              <w:right w:val="single" w:color="808080" w:sz="4"/>
+            </w:tcBorders>
+            <w:tcMar>
+              <w:top w:type="dxa" w:w="60"/>
+              <w:left w:type="dxa" w:w="100"/>
+              <w:bottom w:type="dxa" w:w="60"/>
+              <w:right w:type="dxa" w:w="100"/>
+            </w:tcMar>
+          </w:tcPr>
+          <w:p>
+            <w:pPr>
+              <w:spacing w:before="0" w:after="0"/>
+            </w:pPr>
+            <w:r>
+              <w:rPr>
+                <w:rFonts w:ascii="Arial" w:cs="Arial" w:eastAsia="Arial" w:hAnsi="Arial"/>
+                <w:sz w:val="21"/>
+                <w:szCs w:val="21"/>
+              </w:rPr>
+              <w:t xml:space="preserve">Không xử lý khu vực</w:t>
             </w:r>
           </w:p>
         </w:tc>
@@ -7199,6 +7436,310 @@
                 <w:sz w:val="21"/>
                 <w:szCs w:val="21"/>
               </w:rPr>
+              <w:t xml:space="preserve">10</w:t>
+            </w:r>
+          </w:p>
+        </w:tc>
+        <w:tc>
+          <w:tcPr>
+            <w:tcW w:type="dxa" w:w="700"/>
+            <w:tcBorders>
+              <w:top w:val="single" w:color="808080" w:sz="4"/>
+              <w:left w:val="single" w:color="808080" w:sz="4"/>
+              <w:bottom w:val="single" w:color="808080" w:sz="4"/>
+              <w:right w:val="single" w:color="808080" w:sz="4"/>
+            </w:tcBorders>
+            <w:tcMar>
+              <w:top w:type="dxa" w:w="60"/>
+              <w:left w:type="dxa" w:w="100"/>
+              <w:bottom w:type="dxa" w:w="60"/>
+              <w:right w:type="dxa" w:w="100"/>
+            </w:tcMar>
+          </w:tcPr>
+          <w:p>
+            <w:pPr>
+              <w:spacing w:before="0" w:after="0"/>
+            </w:pPr>
+            <w:r>
+              <w:rPr>
+                <w:rFonts w:ascii="Arial" w:cs="Arial" w:eastAsia="Arial" w:hAnsi="Arial"/>
+                <w:sz w:val="21"/>
+                <w:szCs w:val="21"/>
+              </w:rPr>
+              <w:t xml:space="preserve">Tắt (= 0)</w:t>
+            </w:r>
+          </w:p>
+        </w:tc>
+        <w:tc>
+          <w:tcPr>
+            <w:tcW w:type="dxa" w:w="2972"/>
+            <w:tcBorders>
+              <w:top w:val="single" w:color="808080" w:sz="4"/>
+              <w:left w:val="single" w:color="808080" w:sz="4"/>
+              <w:bottom w:val="single" w:color="808080" w:sz="4"/>
+              <w:right w:val="single" w:color="808080" w:sz="4"/>
+            </w:tcBorders>
+            <w:tcMar>
+              <w:top w:type="dxa" w:w="60"/>
+              <w:left w:type="dxa" w:w="100"/>
+              <w:bottom w:type="dxa" w:w="60"/>
+              <w:right w:type="dxa" w:w="100"/>
+            </w:tcMar>
+          </w:tcPr>
+          <w:p>
+            <w:pPr>
+              <w:spacing w:before="0" w:after="0"/>
+            </w:pPr>
+            <w:r>
+              <w:rPr>
+                <w:rFonts w:ascii="Arial" w:cs="Arial" w:eastAsia="Arial" w:hAnsi="Arial"/>
+                <w:sz w:val="21"/>
+                <w:szCs w:val="21"/>
+              </w:rPr>
+              <w:t xml:space="preserve">Người bệnh cũ K1; thẻ không có khu vực</w:t>
+            </w:r>
+          </w:p>
+        </w:tc>
+        <w:tc>
+          <w:tcPr>
+            <w:tcW w:type="dxa" w:w="2972"/>
+            <w:tcBorders>
+              <w:top w:val="single" w:color="808080" w:sz="4"/>
+              <w:left w:val="single" w:color="808080" w:sz="4"/>
+              <w:bottom w:val="single" w:color="808080" w:sz="4"/>
+              <w:right w:val="single" w:color="808080" w:sz="4"/>
+            </w:tcBorders>
+            <w:tcMar>
+              <w:top w:type="dxa" w:w="60"/>
+              <w:left w:type="dxa" w:w="100"/>
+              <w:bottom w:type="dxa" w:w="60"/>
+              <w:right w:type="dxa" w:w="100"/>
+            </w:tcMar>
+          </w:tcPr>
+          <w:p>
+            <w:pPr>
+              <w:spacing w:before="0" w:after="0"/>
+            </w:pPr>
+            <w:r>
+              <w:rPr>
+                <w:rFonts w:ascii="Arial" w:cs="Arial" w:eastAsia="Arial" w:hAnsi="Arial"/>
+                <w:sz w:val="21"/>
+                <w:szCs w:val="21"/>
+              </w:rPr>
+              <w:t xml:space="preserve">Kiểm tra thẻ, Lưu</w:t>
+            </w:r>
+          </w:p>
+        </w:tc>
+        <w:tc>
+          <w:tcPr>
+            <w:tcW w:type="dxa" w:w="2294"/>
+            <w:tcBorders>
+              <w:top w:val="single" w:color="808080" w:sz="4"/>
+              <w:left w:val="single" w:color="808080" w:sz="4"/>
+              <w:bottom w:val="single" w:color="808080" w:sz="4"/>
+              <w:right w:val="single" w:color="808080" w:sz="4"/>
+            </w:tcBorders>
+            <w:tcMar>
+              <w:top w:type="dxa" w:w="60"/>
+              <w:left w:type="dxa" w:w="100"/>
+              <w:bottom w:type="dxa" w:w="60"/>
+              <w:right w:type="dxa" w:w="100"/>
+            </w:tcMar>
+          </w:tcPr>
+          <w:p>
+            <w:pPr>
+              <w:spacing w:before="0" w:after="0"/>
+            </w:pPr>
+            <w:r>
+              <w:rPr>
+                <w:rFonts w:ascii="Arial" w:cs="Arial" w:eastAsia="Arial" w:hAnsi="Arial"/>
+                <w:sz w:val="21"/>
+                <w:szCs w:val="21"/>
+              </w:rPr>
+              <w:t xml:space="preserve">Giữ K1 như hiện nay</w:t>
+            </w:r>
+          </w:p>
+        </w:tc>
+      </w:tr>
+      <w:tr>
+        <w:tc>
+          <w:tcPr>
+            <w:tcW w:type="dxa" w:w="700"/>
+            <w:tcBorders>
+              <w:top w:val="single" w:color="808080" w:sz="4"/>
+              <w:left w:val="single" w:color="808080" w:sz="4"/>
+              <w:bottom w:val="single" w:color="808080" w:sz="4"/>
+              <w:right w:val="single" w:color="808080" w:sz="4"/>
+            </w:tcBorders>
+            <w:tcMar>
+              <w:top w:type="dxa" w:w="60"/>
+              <w:left w:type="dxa" w:w="100"/>
+              <w:bottom w:type="dxa" w:w="60"/>
+              <w:right w:type="dxa" w:w="100"/>
+            </w:tcMar>
+          </w:tcPr>
+          <w:p>
+            <w:pPr>
+              <w:spacing w:before="0" w:after="0"/>
+            </w:pPr>
+            <w:r>
+              <w:rPr>
+                <w:rFonts w:ascii="Arial" w:cs="Arial" w:eastAsia="Arial" w:hAnsi="Arial"/>
+                <w:sz w:val="21"/>
+                <w:szCs w:val="21"/>
+              </w:rPr>
+              <w:t xml:space="preserve">11</w:t>
+            </w:r>
+          </w:p>
+        </w:tc>
+        <w:tc>
+          <w:tcPr>
+            <w:tcW w:type="dxa" w:w="700"/>
+            <w:tcBorders>
+              <w:top w:val="single" w:color="808080" w:sz="4"/>
+              <w:left w:val="single" w:color="808080" w:sz="4"/>
+              <w:bottom w:val="single" w:color="808080" w:sz="4"/>
+              <w:right w:val="single" w:color="808080" w:sz="4"/>
+            </w:tcBorders>
+            <w:tcMar>
+              <w:top w:type="dxa" w:w="60"/>
+              <w:left w:type="dxa" w:w="100"/>
+              <w:bottom w:type="dxa" w:w="60"/>
+              <w:right w:type="dxa" w:w="100"/>
+            </w:tcMar>
+          </w:tcPr>
+          <w:p>
+            <w:pPr>
+              <w:spacing w:before="0" w:after="0"/>
+            </w:pPr>
+            <w:r>
+              <w:rPr>
+                <w:rFonts w:ascii="Arial" w:cs="Arial" w:eastAsia="Arial" w:hAnsi="Arial"/>
+                <w:sz w:val="21"/>
+                <w:szCs w:val="21"/>
+              </w:rPr>
+              <w:t xml:space="preserve">Chưa khai báo</w:t>
+            </w:r>
+          </w:p>
+        </w:tc>
+        <w:tc>
+          <w:tcPr>
+            <w:tcW w:type="dxa" w:w="2972"/>
+            <w:tcBorders>
+              <w:top w:val="single" w:color="808080" w:sz="4"/>
+              <w:left w:val="single" w:color="808080" w:sz="4"/>
+              <w:bottom w:val="single" w:color="808080" w:sz="4"/>
+              <w:right w:val="single" w:color="808080" w:sz="4"/>
+            </w:tcBorders>
+            <w:tcMar>
+              <w:top w:type="dxa" w:w="60"/>
+              <w:left w:type="dxa" w:w="100"/>
+              <w:bottom w:type="dxa" w:w="60"/>
+              <w:right w:type="dxa" w:w="100"/>
+            </w:tcMar>
+          </w:tcPr>
+          <w:p>
+            <w:pPr>
+              <w:spacing w:before="0" w:after="0"/>
+            </w:pPr>
+            <w:r>
+              <w:rPr>
+                <w:rFonts w:ascii="Arial" w:cs="Arial" w:eastAsia="Arial" w:hAnsi="Arial"/>
+                <w:sz w:val="21"/>
+                <w:szCs w:val="21"/>
+              </w:rPr>
+              <w:t xml:space="preserve">Như kịch bản 10</w:t>
+            </w:r>
+          </w:p>
+        </w:tc>
+        <w:tc>
+          <w:tcPr>
+            <w:tcW w:type="dxa" w:w="2972"/>
+            <w:tcBorders>
+              <w:top w:val="single" w:color="808080" w:sz="4"/>
+              <w:left w:val="single" w:color="808080" w:sz="4"/>
+              <w:bottom w:val="single" w:color="808080" w:sz="4"/>
+              <w:right w:val="single" w:color="808080" w:sz="4"/>
+            </w:tcBorders>
+            <w:tcMar>
+              <w:top w:type="dxa" w:w="60"/>
+              <w:left w:type="dxa" w:w="100"/>
+              <w:bottom w:type="dxa" w:w="60"/>
+              <w:right w:type="dxa" w:w="100"/>
+            </w:tcMar>
+          </w:tcPr>
+          <w:p>
+            <w:pPr>
+              <w:spacing w:before="0" w:after="0"/>
+            </w:pPr>
+            <w:r>
+              <w:rPr>
+                <w:rFonts w:ascii="Arial" w:cs="Arial" w:eastAsia="Arial" w:hAnsi="Arial"/>
+                <w:sz w:val="21"/>
+                <w:szCs w:val="21"/>
+              </w:rPr>
+              <w:t xml:space="preserve">Như kịch bản 10</w:t>
+            </w:r>
+          </w:p>
+        </w:tc>
+        <w:tc>
+          <w:tcPr>
+            <w:tcW w:type="dxa" w:w="2294"/>
+            <w:tcBorders>
+              <w:top w:val="single" w:color="808080" w:sz="4"/>
+              <w:left w:val="single" w:color="808080" w:sz="4"/>
+              <w:bottom w:val="single" w:color="808080" w:sz="4"/>
+              <w:right w:val="single" w:color="808080" w:sz="4"/>
+            </w:tcBorders>
+            <w:tcMar>
+              <w:top w:type="dxa" w:w="60"/>
+              <w:left w:type="dxa" w:w="100"/>
+              <w:bottom w:type="dxa" w:w="60"/>
+              <w:right w:type="dxa" w:w="100"/>
+            </w:tcMar>
+          </w:tcPr>
+          <w:p>
+            <w:pPr>
+              <w:spacing w:before="0" w:after="0"/>
+            </w:pPr>
+            <w:r>
+              <w:rPr>
+                <w:rFonts w:ascii="Arial" w:cs="Arial" w:eastAsia="Arial" w:hAnsi="Arial"/>
+                <w:sz w:val="21"/>
+                <w:szCs w:val="21"/>
+              </w:rPr>
+              <w:t xml:space="preserve">Giữ K1 như hiện nay</w:t>
+            </w:r>
+          </w:p>
+        </w:tc>
+      </w:tr>
+      <w:tr>
+        <w:tc>
+          <w:tcPr>
+            <w:tcW w:type="dxa" w:w="700"/>
+            <w:tcBorders>
+              <w:top w:val="single" w:color="808080" w:sz="4"/>
+              <w:left w:val="single" w:color="808080" w:sz="4"/>
+              <w:bottom w:val="single" w:color="808080" w:sz="4"/>
+              <w:right w:val="single" w:color="808080" w:sz="4"/>
+            </w:tcBorders>
+            <w:tcMar>
+              <w:top w:type="dxa" w:w="60"/>
+              <w:left w:type="dxa" w:w="100"/>
+              <w:bottom w:type="dxa" w:w="60"/>
+              <w:right w:type="dxa" w:w="100"/>
+            </w:tcMar>
+          </w:tcPr>
+          <w:p>
+            <w:pPr>
+              <w:spacing w:before="0" w:after="0"/>
+            </w:pPr>
+            <w:r>
+              <w:rPr>
+                <w:rFonts w:ascii="Arial" w:cs="Arial" w:eastAsia="Arial" w:hAnsi="Arial"/>
+                <w:sz w:val="21"/>
+                <w:szCs w:val="21"/>
+              </w:rPr>
               <w:t xml:space="preserve">12</w:t>
             </w:r>
           </w:p>
@@ -7235,7 +7776,7 @@
         </w:tc>
         <w:tc>
           <w:tcPr>
-            <w:tcW w:type="dxa" w:w="3109"/>
+            <w:tcW w:type="dxa" w:w="2972"/>
             <w:tcBorders>
               <w:top w:val="single" w:color="808080" w:sz="4"/>
               <w:left w:val="single" w:color="808080" w:sz="4"/>
@@ -7265,7 +7806,7 @@
         </w:tc>
         <w:tc>
           <w:tcPr>
-            <w:tcW w:type="dxa" w:w="2664"/>
+            <w:tcW w:type="dxa" w:w="2972"/>
             <w:tcBorders>
               <w:top w:val="single" w:color="808080" w:sz="4"/>
               <w:left w:val="single" w:color="808080" w:sz="4"/>
@@ -7295,7 +7836,7 @@
         </w:tc>
         <w:tc>
           <w:tcPr>
-            <w:tcW w:type="dxa" w:w="2465"/>
+            <w:tcW w:type="dxa" w:w="2294"/>
             <w:tcBorders>
               <w:top w:val="single" w:color="808080" w:sz="4"/>
               <w:left w:val="single" w:color="808080" w:sz="4"/>

</xml_diff>